<commit_message>
docs(perturbation-j2): benchmark + ADR-0001 + sprint backlog reactualise
Livrables de la perturbation J2 (decision technique sous contrainte :
latence generation 45s -> cible <=15s) :

- docs/perturbations/j2-technique.md : protocole de mesure (5 runs,
  mediane + p95, qualite /5 par 3 testeurs), tableau de benchmark sur 4
  modeles (Ollama llama3.1:8b / phi3:mini / mistral:7b, Mistral UE) +
  Groq exclu, grille qualite, checklist CA-J2-1..7.
- docs/cadrage/adr/adr-0001-choix-modele-llm.md : ADR (5 sections) qui
  arbitre latence vs souverainete RGPD ; decision proposee = modele local
  leger (phi3:mini), repli Mistral UE, Groq/US exclu par defaut.
- docs/cadrage/sprint-backlog.md : section 7 reactualisation J2 (taches
  d'investigation/bascule T-J2.1..6, re-estimation avant/apres des stories
  US-X.3, US-F3.1, US-F3.4, communication PO).
- generate.py : auto-decouverte des ADR (docs/cadrage/adr/*.md).

Tout trace sur le backlog (US-X.3, SPK-2, US-W.3) et le release planning (S3).
</commit_message>
<xml_diff>
--- a/docs/cadrage/equipe-6-sprint-backlog-v1.0.docx
+++ b/docs/cadrage/equipe-6-sprint-backlog-v1.0.docx
@@ -3071,6 +3071,1076 @@
       </w:r>
       <w:r>
         <w:t xml:space="preserve"> : courte rétro en fin de journée (ce qui a marché / à améliorer).</w:t>
+      </w:r>
+    </w:p>
+    <w:p>
+      <w:pPr>
+        <w:pStyle w:val="Heading1"/>
+      </w:pPr>
+      <w:r>
+        <w:t>7. Réactualisation — perturbation J2 (décision technique LLM) *(CA-J2-5)*</w:t>
+      </w:r>
+    </w:p>
+    <w:p>
+      <w:pPr>
+        <w:ind w:left="454"/>
+      </w:pPr>
+      <w:r>
+        <w:t xml:space="preserve">Suite à la </w:t>
+      </w:r>
+      <w:r>
+        <w:rPr>
+          <w:b/>
+        </w:rPr>
+        <w:t>perturbation J2</w:t>
+      </w:r>
+      <w:r>
+        <w:t xml:space="preserve"> (mardi 10h — latence 45 s → cible ≤ 15 s), des </w:t>
+      </w:r>
+      <w:r>
+        <w:rPr>
+          <w:b/>
+        </w:rPr>
+        <w:t>tâches d'investigation/bascule</w:t>
+      </w:r>
+      <w:r>
+        <w:t xml:space="preserve"> sont ajoutées et les stories impactées sont </w:t>
+      </w:r>
+      <w:r>
+        <w:rPr>
+          <w:b/>
+        </w:rPr>
+        <w:t>re-estimées</w:t>
+      </w:r>
+      <w:r>
+        <w:t xml:space="preserve">. Ces tâches sont planifiées sur le </w:t>
+      </w:r>
+      <w:r>
+        <w:rPr>
+          <w:b/>
+        </w:rPr>
+        <w:t>Sprint 3</w:t>
+      </w:r>
+      <w:r>
+        <w:t xml:space="preserve"> (mardi 14h-18h, cf. Release Planning). Détail : Perturbation J2 · ADR-0001.</w:t>
+      </w:r>
+    </w:p>
+    <w:p>
+      <w:pPr>
+        <w:pStyle w:val="Heading2"/>
+      </w:pPr>
+      <w:r>
+        <w:t>7.1 Nouvelles tâches d'investigation / bascule</w:t>
+      </w:r>
+    </w:p>
+    <w:tbl>
+      <w:tblPr>
+        <w:tblStyle w:val="LightGrid-Accent1"/>
+        <w:tblW w:type="auto" w:w="0"/>
+        <w:jc w:val="center"/>
+        <w:tblLook w:firstColumn="1" w:firstRow="1" w:lastColumn="0" w:lastRow="0" w:noHBand="0" w:noVBand="1" w:val="04A0"/>
+      </w:tblPr>
+      <w:tblGrid>
+        <w:gridCol w:w="1234"/>
+        <w:gridCol w:w="1234"/>
+        <w:gridCol w:w="1234"/>
+        <w:gridCol w:w="1234"/>
+        <w:gridCol w:w="1234"/>
+        <w:gridCol w:w="1234"/>
+        <w:gridCol w:w="1234"/>
+      </w:tblGrid>
+      <w:tr>
+        <w:tc>
+          <w:tcPr>
+            <w:tcW w:type="dxa" w:w="1234"/>
+          </w:tcPr>
+          <w:p>
+            <w:r/>
+            <w:r>
+              <w:rPr>
+                <w:b/>
+              </w:rPr>
+              <w:t>US</w:t>
+            </w:r>
+          </w:p>
+        </w:tc>
+        <w:tc>
+          <w:tcPr>
+            <w:tcW w:type="dxa" w:w="1234"/>
+          </w:tcPr>
+          <w:p>
+            <w:r/>
+            <w:r>
+              <w:rPr>
+                <w:b/>
+              </w:rPr>
+              <w:t>ID tâche</w:t>
+            </w:r>
+          </w:p>
+        </w:tc>
+        <w:tc>
+          <w:tcPr>
+            <w:tcW w:type="dxa" w:w="1234"/>
+          </w:tcPr>
+          <w:p>
+            <w:r/>
+            <w:r>
+              <w:rPr>
+                <w:b/>
+              </w:rPr>
+              <w:t>Tâche technique</w:t>
+            </w:r>
+          </w:p>
+        </w:tc>
+        <w:tc>
+          <w:tcPr>
+            <w:tcW w:type="dxa" w:w="1234"/>
+          </w:tcPr>
+          <w:p>
+            <w:r/>
+            <w:r>
+              <w:rPr>
+                <w:b/>
+              </w:rPr>
+              <w:t>Type</w:t>
+            </w:r>
+          </w:p>
+        </w:tc>
+        <w:tc>
+          <w:tcPr>
+            <w:tcW w:type="dxa" w:w="1234"/>
+          </w:tcPr>
+          <w:p>
+            <w:r/>
+            <w:r>
+              <w:rPr>
+                <w:b/>
+              </w:rPr>
+              <w:t>Assigné</w:t>
+            </w:r>
+          </w:p>
+        </w:tc>
+        <w:tc>
+          <w:tcPr>
+            <w:tcW w:type="dxa" w:w="1234"/>
+          </w:tcPr>
+          <w:p>
+            <w:r/>
+            <w:r>
+              <w:rPr>
+                <w:b/>
+              </w:rPr>
+              <w:t>Estim. (h)</w:t>
+            </w:r>
+          </w:p>
+        </w:tc>
+        <w:tc>
+          <w:tcPr>
+            <w:tcW w:type="dxa" w:w="1234"/>
+          </w:tcPr>
+          <w:p>
+            <w:r/>
+            <w:r>
+              <w:rPr>
+                <w:b/>
+              </w:rPr>
+              <w:t>Statut</w:t>
+            </w:r>
+          </w:p>
+        </w:tc>
+      </w:tr>
+      <w:tr>
+        <w:tc>
+          <w:tcPr>
+            <w:tcW w:type="dxa" w:w="1234"/>
+          </w:tcPr>
+          <w:p>
+            <w:r/>
+            <w:r>
+              <w:t>US-X.3</w:t>
+            </w:r>
+          </w:p>
+        </w:tc>
+        <w:tc>
+          <w:tcPr>
+            <w:tcW w:type="dxa" w:w="1234"/>
+          </w:tcPr>
+          <w:p>
+            <w:r/>
+            <w:r>
+              <w:t>T-J2.1</w:t>
+            </w:r>
+          </w:p>
+        </w:tc>
+        <w:tc>
+          <w:tcPr>
+            <w:tcW w:type="dxa" w:w="1234"/>
+          </w:tcPr>
+          <w:p>
+            <w:r/>
+            <w:r>
+              <w:t>Harnais de mesure latence (5 runs, médiane + p95) autour de la génération</w:t>
+            </w:r>
+          </w:p>
+        </w:tc>
+        <w:tc>
+          <w:tcPr>
+            <w:tcW w:type="dxa" w:w="1234"/>
+          </w:tcPr>
+          <w:p>
+            <w:r/>
+            <w:r>
+              <w:t>Back</w:t>
+            </w:r>
+          </w:p>
+        </w:tc>
+        <w:tc>
+          <w:tcPr>
+            <w:tcW w:type="dxa" w:w="1234"/>
+          </w:tcPr>
+          <w:p>
+            <w:r/>
+            <w:r>
+              <w:t>Kahil MOKHTARI</w:t>
+            </w:r>
+          </w:p>
+        </w:tc>
+        <w:tc>
+          <w:tcPr>
+            <w:tcW w:type="dxa" w:w="1234"/>
+          </w:tcPr>
+          <w:p>
+            <w:r/>
+            <w:r>
+              <w:t>2</w:t>
+            </w:r>
+          </w:p>
+        </w:tc>
+        <w:tc>
+          <w:tcPr>
+            <w:tcW w:type="dxa" w:w="1234"/>
+          </w:tcPr>
+          <w:p>
+            <w:r/>
+            <w:r>
+              <w:t>Todo</w:t>
+            </w:r>
+          </w:p>
+        </w:tc>
+      </w:tr>
+      <w:tr>
+        <w:tc>
+          <w:tcPr>
+            <w:tcW w:type="dxa" w:w="1234"/>
+          </w:tcPr>
+          <w:p>
+            <w:r/>
+            <w:r>
+              <w:t>US-X.3</w:t>
+            </w:r>
+          </w:p>
+        </w:tc>
+        <w:tc>
+          <w:tcPr>
+            <w:tcW w:type="dxa" w:w="1234"/>
+          </w:tcPr>
+          <w:p>
+            <w:r/>
+            <w:r>
+              <w:t>T-J2.2</w:t>
+            </w:r>
+          </w:p>
+        </w:tc>
+        <w:tc>
+          <w:tcPr>
+            <w:tcW w:type="dxa" w:w="1234"/>
+          </w:tcPr>
+          <w:p>
+            <w:r/>
+            <w:r>
+              <w:t>Exécuter le benchmark sur 4 modèles (llama3.1:8b, phi3:mini, mistral:7b, Mistral UE)</w:t>
+            </w:r>
+          </w:p>
+        </w:tc>
+        <w:tc>
+          <w:tcPr>
+            <w:tcW w:type="dxa" w:w="1234"/>
+          </w:tcPr>
+          <w:p>
+            <w:r/>
+            <w:r>
+              <w:t>Back</w:t>
+            </w:r>
+          </w:p>
+        </w:tc>
+        <w:tc>
+          <w:tcPr>
+            <w:tcW w:type="dxa" w:w="1234"/>
+          </w:tcPr>
+          <w:p>
+            <w:r/>
+            <w:r>
+              <w:t>Souleymane FALL</w:t>
+            </w:r>
+          </w:p>
+        </w:tc>
+        <w:tc>
+          <w:tcPr>
+            <w:tcW w:type="dxa" w:w="1234"/>
+          </w:tcPr>
+          <w:p>
+            <w:r/>
+            <w:r>
+              <w:t>2</w:t>
+            </w:r>
+          </w:p>
+        </w:tc>
+        <w:tc>
+          <w:tcPr>
+            <w:tcW w:type="dxa" w:w="1234"/>
+          </w:tcPr>
+          <w:p>
+            <w:r/>
+            <w:r>
+              <w:t>Todo</w:t>
+            </w:r>
+          </w:p>
+        </w:tc>
+      </w:tr>
+      <w:tr>
+        <w:tc>
+          <w:tcPr>
+            <w:tcW w:type="dxa" w:w="1234"/>
+          </w:tcPr>
+          <w:p>
+            <w:r/>
+            <w:r>
+              <w:t>US-X.3</w:t>
+            </w:r>
+          </w:p>
+        </w:tc>
+        <w:tc>
+          <w:tcPr>
+            <w:tcW w:type="dxa" w:w="1234"/>
+          </w:tcPr>
+          <w:p>
+            <w:r/>
+            <w:r>
+              <w:t>T-J2.3</w:t>
+            </w:r>
+          </w:p>
+        </w:tc>
+        <w:tc>
+          <w:tcPr>
+            <w:tcW w:type="dxa" w:w="1234"/>
+          </w:tcPr>
+          <w:p>
+            <w:r/>
+            <w:r>
+              <w:t>Noter la qualité /5 des quiz (3 testeurs) + consolider le tableau</w:t>
+            </w:r>
+          </w:p>
+        </w:tc>
+        <w:tc>
+          <w:tcPr>
+            <w:tcW w:type="dxa" w:w="1234"/>
+          </w:tcPr>
+          <w:p>
+            <w:r/>
+            <w:r>
+              <w:t>Test</w:t>
+            </w:r>
+          </w:p>
+        </w:tc>
+        <w:tc>
+          <w:tcPr>
+            <w:tcW w:type="dxa" w:w="1234"/>
+          </w:tcPr>
+          <w:p>
+            <w:r/>
+            <w:r>
+              <w:t>Dina · Nikola · Rayan</w:t>
+            </w:r>
+          </w:p>
+        </w:tc>
+        <w:tc>
+          <w:tcPr>
+            <w:tcW w:type="dxa" w:w="1234"/>
+          </w:tcPr>
+          <w:p>
+            <w:r/>
+            <w:r>
+              <w:t>1</w:t>
+            </w:r>
+          </w:p>
+        </w:tc>
+        <w:tc>
+          <w:tcPr>
+            <w:tcW w:type="dxa" w:w="1234"/>
+          </w:tcPr>
+          <w:p>
+            <w:r/>
+            <w:r>
+              <w:t>Todo</w:t>
+            </w:r>
+          </w:p>
+        </w:tc>
+      </w:tr>
+      <w:tr>
+        <w:tc>
+          <w:tcPr>
+            <w:tcW w:type="dxa" w:w="1234"/>
+          </w:tcPr>
+          <w:p>
+            <w:r/>
+            <w:r>
+              <w:t>US-X.3</w:t>
+            </w:r>
+          </w:p>
+        </w:tc>
+        <w:tc>
+          <w:tcPr>
+            <w:tcW w:type="dxa" w:w="1234"/>
+          </w:tcPr>
+          <w:p>
+            <w:r/>
+            <w:r>
+              <w:t>T-J2.4</w:t>
+            </w:r>
+          </w:p>
+        </w:tc>
+        <w:tc>
+          <w:tcPr>
+            <w:tcW w:type="dxa" w:w="1234"/>
+          </w:tcPr>
+          <w:p>
+            <w:r/>
+            <w:r>
+              <w:t>Rédiger et faire signer l'ADR-0001 (décision modèle)</w:t>
+            </w:r>
+          </w:p>
+        </w:tc>
+        <w:tc>
+          <w:tcPr>
+            <w:tcW w:type="dxa" w:w="1234"/>
+          </w:tcPr>
+          <w:p>
+            <w:r/>
+            <w:r>
+              <w:t>Doc</w:t>
+            </w:r>
+          </w:p>
+        </w:tc>
+        <w:tc>
+          <w:tcPr>
+            <w:tcW w:type="dxa" w:w="1234"/>
+          </w:tcPr>
+          <w:p>
+            <w:r/>
+            <w:r>
+              <w:t>Amine HADDANE · Hugo RAGUIN</w:t>
+            </w:r>
+          </w:p>
+        </w:tc>
+        <w:tc>
+          <w:tcPr>
+            <w:tcW w:type="dxa" w:w="1234"/>
+          </w:tcPr>
+          <w:p>
+            <w:r/>
+            <w:r>
+              <w:t>1</w:t>
+            </w:r>
+          </w:p>
+        </w:tc>
+        <w:tc>
+          <w:tcPr>
+            <w:tcW w:type="dxa" w:w="1234"/>
+          </w:tcPr>
+          <w:p>
+            <w:r/>
+            <w:r>
+              <w:t>Todo</w:t>
+            </w:r>
+          </w:p>
+        </w:tc>
+      </w:tr>
+      <w:tr>
+        <w:tc>
+          <w:tcPr>
+            <w:tcW w:type="dxa" w:w="1234"/>
+          </w:tcPr>
+          <w:p>
+            <w:r/>
+            <w:r>
+              <w:t>US-F3.1</w:t>
+            </w:r>
+          </w:p>
+        </w:tc>
+        <w:tc>
+          <w:tcPr>
+            <w:tcW w:type="dxa" w:w="1234"/>
+          </w:tcPr>
+          <w:p>
+            <w:r/>
+            <w:r>
+              <w:t>T-J2.5</w:t>
+            </w:r>
+          </w:p>
+        </w:tc>
+        <w:tc>
+          <w:tcPr>
+            <w:tcW w:type="dxa" w:w="1234"/>
+          </w:tcPr>
+          <w:p>
+            <w:r/>
+            <w:r>
+              <w:t xml:space="preserve">Basculer sur le modèle retenu (config </w:t>
+            </w:r>
+            <w:r>
+              <w:rPr>
+                <w:rFonts w:ascii="Consolas" w:hAnsi="Consolas"/>
+              </w:rPr>
+              <w:t>OLLAMA_MODEL</w:t>
+            </w:r>
+            <w:r>
+              <w:t>/provider) + vérifier ≤ 15 s</w:t>
+            </w:r>
+          </w:p>
+        </w:tc>
+        <w:tc>
+          <w:tcPr>
+            <w:tcW w:type="dxa" w:w="1234"/>
+          </w:tcPr>
+          <w:p>
+            <w:r/>
+            <w:r>
+              <w:t>Back</w:t>
+            </w:r>
+          </w:p>
+        </w:tc>
+        <w:tc>
+          <w:tcPr>
+            <w:tcW w:type="dxa" w:w="1234"/>
+          </w:tcPr>
+          <w:p>
+            <w:r/>
+            <w:r>
+              <w:t>Souleymane · Kahil</w:t>
+            </w:r>
+          </w:p>
+        </w:tc>
+        <w:tc>
+          <w:tcPr>
+            <w:tcW w:type="dxa" w:w="1234"/>
+          </w:tcPr>
+          <w:p>
+            <w:r/>
+            <w:r>
+              <w:t>2</w:t>
+            </w:r>
+          </w:p>
+        </w:tc>
+        <w:tc>
+          <w:tcPr>
+            <w:tcW w:type="dxa" w:w="1234"/>
+          </w:tcPr>
+          <w:p>
+            <w:r/>
+            <w:r>
+              <w:t>Todo</w:t>
+            </w:r>
+          </w:p>
+        </w:tc>
+      </w:tr>
+      <w:tr>
+        <w:tc>
+          <w:tcPr>
+            <w:tcW w:type="dxa" w:w="1234"/>
+          </w:tcPr>
+          <w:p>
+            <w:r/>
+            <w:r>
+              <w:t>US-F3.1</w:t>
+            </w:r>
+          </w:p>
+        </w:tc>
+        <w:tc>
+          <w:tcPr>
+            <w:tcW w:type="dxa" w:w="1234"/>
+          </w:tcPr>
+          <w:p>
+            <w:r/>
+            <w:r>
+              <w:t>T-J2.6</w:t>
+            </w:r>
+          </w:p>
+        </w:tc>
+        <w:tc>
+          <w:tcPr>
+            <w:tcW w:type="dxa" w:w="1234"/>
+          </w:tcPr>
+          <w:p>
+            <w:r/>
+            <w:r>
+              <w:t>Ajuster le prompt au nouveau modèle (préserver qualité ≥ 4/5)</w:t>
+            </w:r>
+          </w:p>
+        </w:tc>
+        <w:tc>
+          <w:tcPr>
+            <w:tcW w:type="dxa" w:w="1234"/>
+          </w:tcPr>
+          <w:p>
+            <w:r/>
+            <w:r>
+              <w:t>Back</w:t>
+            </w:r>
+          </w:p>
+        </w:tc>
+        <w:tc>
+          <w:tcPr>
+            <w:tcW w:type="dxa" w:w="1234"/>
+          </w:tcPr>
+          <w:p>
+            <w:r/>
+            <w:r>
+              <w:t>Kahil MOKHTARI</w:t>
+            </w:r>
+          </w:p>
+        </w:tc>
+        <w:tc>
+          <w:tcPr>
+            <w:tcW w:type="dxa" w:w="1234"/>
+          </w:tcPr>
+          <w:p>
+            <w:r/>
+            <w:r>
+              <w:t>1</w:t>
+            </w:r>
+          </w:p>
+        </w:tc>
+        <w:tc>
+          <w:tcPr>
+            <w:tcW w:type="dxa" w:w="1234"/>
+          </w:tcPr>
+          <w:p>
+            <w:r/>
+            <w:r>
+              <w:t>Todo</w:t>
+            </w:r>
+          </w:p>
+        </w:tc>
+      </w:tr>
+    </w:tbl>
+    <w:p/>
+    <w:p>
+      <w:pPr>
+        <w:pStyle w:val="Heading2"/>
+      </w:pPr>
+      <w:r>
+        <w:t>7.2 Re-estimation des stories impactées (avant / après)</w:t>
+      </w:r>
+    </w:p>
+    <w:tbl>
+      <w:tblPr>
+        <w:tblStyle w:val="LightGrid-Accent1"/>
+        <w:tblW w:type="auto" w:w="0"/>
+        <w:jc w:val="center"/>
+        <w:tblLook w:firstColumn="1" w:firstRow="1" w:lastColumn="0" w:lastRow="0" w:noHBand="0" w:noVBand="1" w:val="04A0"/>
+      </w:tblPr>
+      <w:tblGrid>
+        <w:gridCol w:w="2160"/>
+        <w:gridCol w:w="2160"/>
+        <w:gridCol w:w="2160"/>
+        <w:gridCol w:w="2160"/>
+      </w:tblGrid>
+      <w:tr>
+        <w:tc>
+          <w:tcPr>
+            <w:tcW w:type="dxa" w:w="2160"/>
+          </w:tcPr>
+          <w:p>
+            <w:r/>
+            <w:r>
+              <w:rPr>
+                <w:b/>
+              </w:rPr>
+              <w:t>Story</w:t>
+            </w:r>
+          </w:p>
+        </w:tc>
+        <w:tc>
+          <w:tcPr>
+            <w:tcW w:type="dxa" w:w="2160"/>
+          </w:tcPr>
+          <w:p>
+            <w:r/>
+            <w:r>
+              <w:rPr>
+                <w:b/>
+              </w:rPr>
+              <w:t>SP avant</w:t>
+            </w:r>
+          </w:p>
+        </w:tc>
+        <w:tc>
+          <w:tcPr>
+            <w:tcW w:type="dxa" w:w="2160"/>
+          </w:tcPr>
+          <w:p>
+            <w:r/>
+            <w:r>
+              <w:rPr>
+                <w:b/>
+              </w:rPr>
+              <w:t>SP après</w:t>
+            </w:r>
+          </w:p>
+        </w:tc>
+        <w:tc>
+          <w:tcPr>
+            <w:tcW w:type="dxa" w:w="2160"/>
+          </w:tcPr>
+          <w:p>
+            <w:r/>
+            <w:r>
+              <w:rPr>
+                <w:b/>
+              </w:rPr>
+              <w:t>Raison</w:t>
+            </w:r>
+          </w:p>
+        </w:tc>
+      </w:tr>
+      <w:tr>
+        <w:tc>
+          <w:tcPr>
+            <w:tcW w:type="dxa" w:w="2160"/>
+          </w:tcPr>
+          <w:p>
+            <w:r/>
+            <w:r>
+              <w:rPr>
+                <w:b/>
+              </w:rPr>
+              <w:t>US-X.3</w:t>
+            </w:r>
+            <w:r>
+              <w:t xml:space="preserve"> </w:t>
+            </w:r>
+            <w:r>
+              <w:rPr>
+                <w:i/>
+              </w:rPr>
+              <w:t>(tracer le choix LLM / ADR)</w:t>
+            </w:r>
+          </w:p>
+        </w:tc>
+        <w:tc>
+          <w:tcPr>
+            <w:tcW w:type="dxa" w:w="2160"/>
+          </w:tcPr>
+          <w:p>
+            <w:r/>
+            <w:r>
+              <w:t>3</w:t>
+            </w:r>
+          </w:p>
+        </w:tc>
+        <w:tc>
+          <w:tcPr>
+            <w:tcW w:type="dxa" w:w="2160"/>
+          </w:tcPr>
+          <w:p>
+            <w:r/>
+            <w:r>
+              <w:rPr>
+                <w:b/>
+              </w:rPr>
+              <w:t>5</w:t>
+            </w:r>
+          </w:p>
+        </w:tc>
+        <w:tc>
+          <w:tcPr>
+            <w:tcW w:type="dxa" w:w="2160"/>
+          </w:tcPr>
+          <w:p>
+            <w:r/>
+            <w:r>
+              <w:t>inclut désormais benchmark méthodologique + scoring qualité + ADR</w:t>
+            </w:r>
+          </w:p>
+        </w:tc>
+      </w:tr>
+      <w:tr>
+        <w:tc>
+          <w:tcPr>
+            <w:tcW w:type="dxa" w:w="2160"/>
+          </w:tcPr>
+          <w:p>
+            <w:r/>
+            <w:r>
+              <w:rPr>
+                <w:b/>
+              </w:rPr>
+              <w:t>US-F3.1</w:t>
+            </w:r>
+            <w:r>
+              <w:t xml:space="preserve"> </w:t>
+            </w:r>
+            <w:r>
+              <w:rPr>
+                <w:i/>
+              </w:rPr>
+              <w:t>(générer 10 QCM)</w:t>
+            </w:r>
+          </w:p>
+        </w:tc>
+        <w:tc>
+          <w:tcPr>
+            <w:tcW w:type="dxa" w:w="2160"/>
+          </w:tcPr>
+          <w:p>
+            <w:r/>
+            <w:r>
+              <w:t>5</w:t>
+            </w:r>
+          </w:p>
+        </w:tc>
+        <w:tc>
+          <w:tcPr>
+            <w:tcW w:type="dxa" w:w="2160"/>
+          </w:tcPr>
+          <w:p>
+            <w:r/>
+            <w:r>
+              <w:rPr>
+                <w:b/>
+              </w:rPr>
+              <w:t>6</w:t>
+            </w:r>
+          </w:p>
+        </w:tc>
+        <w:tc>
+          <w:tcPr>
+            <w:tcW w:type="dxa" w:w="2160"/>
+          </w:tcPr>
+          <w:p>
+            <w:r/>
+            <w:r>
+              <w:t>ajoute la bascule de modèle + revérification du SLA latence</w:t>
+            </w:r>
+          </w:p>
+        </w:tc>
+      </w:tr>
+      <w:tr>
+        <w:tc>
+          <w:tcPr>
+            <w:tcW w:type="dxa" w:w="2160"/>
+          </w:tcPr>
+          <w:p>
+            <w:r/>
+            <w:r>
+              <w:rPr>
+                <w:b/>
+              </w:rPr>
+              <w:t>US-F3.4</w:t>
+            </w:r>
+            <w:r>
+              <w:t xml:space="preserve"> </w:t>
+            </w:r>
+            <w:r>
+              <w:rPr>
+                <w:i/>
+              </w:rPr>
+              <w:t>(erreur/timeout LLM)</w:t>
+            </w:r>
+          </w:p>
+        </w:tc>
+        <w:tc>
+          <w:tcPr>
+            <w:tcW w:type="dxa" w:w="2160"/>
+          </w:tcPr>
+          <w:p>
+            <w:r/>
+            <w:r>
+              <w:t>3</w:t>
+            </w:r>
+          </w:p>
+        </w:tc>
+        <w:tc>
+          <w:tcPr>
+            <w:tcW w:type="dxa" w:w="2160"/>
+          </w:tcPr>
+          <w:p>
+            <w:r/>
+            <w:r>
+              <w:rPr>
+                <w:b/>
+              </w:rPr>
+              <w:t>2</w:t>
+            </w:r>
+          </w:p>
+        </w:tc>
+        <w:tc>
+          <w:tcPr>
+            <w:tcW w:type="dxa" w:w="2160"/>
+          </w:tcPr>
+          <w:p>
+            <w:r/>
+            <w:r>
+              <w:t>un modèle plus rapide réduit le risque de timeout</w:t>
+            </w:r>
+          </w:p>
+        </w:tc>
+      </w:tr>
+      <w:tr>
+        <w:tc>
+          <w:tcPr>
+            <w:tcW w:type="dxa" w:w="2160"/>
+          </w:tcPr>
+          <w:p>
+            <w:r/>
+            <w:r>
+              <w:rPr>
+                <w:b/>
+              </w:rPr>
+              <w:t>Spike SPK-2</w:t>
+            </w:r>
+            <w:r>
+              <w:t xml:space="preserve"> </w:t>
+            </w:r>
+            <w:r>
+              <w:rPr>
+                <w:i/>
+              </w:rPr>
+              <w:t>(ADR LLM)</w:t>
+            </w:r>
+          </w:p>
+        </w:tc>
+        <w:tc>
+          <w:tcPr>
+            <w:tcW w:type="dxa" w:w="2160"/>
+          </w:tcPr>
+          <w:p>
+            <w:r/>
+            <w:r>
+              <w:t>3</w:t>
+            </w:r>
+          </w:p>
+        </w:tc>
+        <w:tc>
+          <w:tcPr>
+            <w:tcW w:type="dxa" w:w="2160"/>
+          </w:tcPr>
+          <w:p>
+            <w:r/>
+            <w:r>
+              <w:rPr>
+                <w:b/>
+              </w:rPr>
+              <w:t>3</w:t>
+            </w:r>
+          </w:p>
+        </w:tc>
+        <w:tc>
+          <w:tcPr>
+            <w:tcW w:type="dxa" w:w="2160"/>
+          </w:tcPr>
+          <w:p>
+            <w:r/>
+            <w:r>
+              <w:t>inchangé (absorbé par T-J2.1→T-J2.4)</w:t>
+            </w:r>
+          </w:p>
+        </w:tc>
+      </w:tr>
+      <w:tr>
+        <w:tc>
+          <w:tcPr>
+            <w:tcW w:type="dxa" w:w="2160"/>
+          </w:tcPr>
+          <w:p>
+            <w:r/>
+            <w:r>
+              <w:rPr>
+                <w:b/>
+              </w:rPr>
+              <w:t>Total impacté</w:t>
+            </w:r>
+          </w:p>
+        </w:tc>
+        <w:tc>
+          <w:tcPr>
+            <w:tcW w:type="dxa" w:w="2160"/>
+          </w:tcPr>
+          <w:p>
+            <w:r/>
+            <w:r>
+              <w:t>14</w:t>
+            </w:r>
+          </w:p>
+        </w:tc>
+        <w:tc>
+          <w:tcPr>
+            <w:tcW w:type="dxa" w:w="2160"/>
+          </w:tcPr>
+          <w:p>
+            <w:r/>
+            <w:r>
+              <w:rPr>
+                <w:b/>
+              </w:rPr>
+              <w:t>16</w:t>
+            </w:r>
+          </w:p>
+        </w:tc>
+        <w:tc>
+          <w:tcPr>
+            <w:tcW w:type="dxa" w:w="2160"/>
+          </w:tcPr>
+          <w:p>
+            <w:r/>
+            <w:r>
+              <w:t>+2 SP → absorbés dans la marge du Sprint 3 (vélocité visée 20)</w:t>
+            </w:r>
+          </w:p>
+        </w:tc>
+      </w:tr>
+    </w:tbl>
+    <w:p/>
+    <w:p>
+      <w:pPr>
+        <w:ind w:left="454"/>
+      </w:pPr>
+      <w:r>
+        <w:rPr>
+          <w:b/>
+        </w:rPr>
+        <w:t>Communication PO</w:t>
+      </w:r>
+      <w:r>
+        <w:t xml:space="preserve"> : impact planning annoncé immédiatement — la décision technique tient dans le </w:t>
+      </w:r>
+      <w:r>
+        <w:rPr>
+          <w:b/>
+        </w:rPr>
+        <w:t>Sprint 3</w:t>
+      </w:r>
+      <w:r>
+        <w:t xml:space="preserve"> sans décaler la </w:t>
+      </w:r>
+      <w:r>
+        <w:rPr>
+          <w:b/>
+        </w:rPr>
+        <w:t>Release 1</w:t>
+      </w:r>
+      <w:r>
+        <w:t xml:space="preserve"> (mercredi 17h45). Aucune story MVP retirée.</w:t>
       </w:r>
     </w:p>
     <w:p>

</xml_diff>

<commit_message>
feat(llm): harnais de benchmark bench_llm + maj livrables J2
Tache T-J2.1 reellement realisee : commande Django bench_llm qui mesure
la latence (mediane + p95 sur N runs) de generate_quiz() pour chaque
modele et produit le tableau Markdown du benchmark J2.

- backend/llm/management/commands/bench_llm.py : harnais branche sur
  l'interface reelle (Ollama/Mistral/Groq/mock via la factory), skip
  propre des fournisseurs sans cle. Valide en mode mock (10/10 questions).
- docs/perturbations/j2-technique.md : commandes d'execution pretes
  (ollama pull + manage.py bench_llm) pour remplir le tableau avec les
  vrais chiffres sur une machine equipee.
- sprint-backlog.md : T-J2.1 marquee Fait.

Note: les vraies latences (phi3:mini, mistral:7b, Mistral UE) ne sont pas
mesurables dans cet environnement (pas d'Ollama ni de cles API) - a lancer
sur le poste de Souleymane via la commande fournie.
</commit_message>
<xml_diff>
--- a/docs/cadrage/equipe-6-sprint-backlog-v1.0.docx
+++ b/docs/cadrage/equipe-6-sprint-backlog-v1.0.docx
@@ -3279,7 +3279,13 @@
           <w:p>
             <w:r/>
             <w:r>
-              <w:t>Harnais de mesure latence (5 runs, médiane + p95) autour de la génération</w:t>
+              <w:t xml:space="preserve">Harnais de mesure latence (5 runs, médiane + p95) autour de la génération — </w:t>
+            </w:r>
+            <w:r>
+              <w:rPr>
+                <w:rFonts w:ascii="Consolas" w:hAnsi="Consolas"/>
+              </w:rPr>
+              <w:t>backend/llm/management/commands/bench_llm.py</w:t>
             </w:r>
           </w:p>
         </w:tc>
@@ -3323,7 +3329,7 @@
           <w:p>
             <w:r/>
             <w:r>
-              <w:t>Todo</w:t>
+              <w:t>✅ Fait</w:t>
             </w:r>
           </w:p>
         </w:tc>

</xml_diff>